<commit_message>
Complete Part 2, Lesson 2
</commit_message>
<xml_diff>
--- a/Minh chứng/Kết quả phần 1.docx
+++ b/Minh chứng/Kết quả phần 1.docx
@@ -16,6 +16,9 @@
     </w:p>
     <w:p>
       <w:r>
+        <w:rPr>
+          <w:noProof/>
+        </w:rPr>
         <w:drawing>
           <wp:inline distT="0" distB="0" distL="0" distR="0" wp14:anchorId="2C975271" wp14:editId="196E0A5E">
             <wp:extent cx="5943600" cy="3342005"/>
@@ -67,6 +70,9 @@
     </w:p>
     <w:p>
       <w:r>
+        <w:rPr>
+          <w:noProof/>
+        </w:rPr>
         <w:drawing>
           <wp:inline distT="0" distB="0" distL="0" distR="0" wp14:anchorId="28787A03" wp14:editId="0886CF87">
             <wp:extent cx="5943600" cy="3342005"/>
@@ -119,6 +125,9 @@
     </w:p>
     <w:p>
       <w:r>
+        <w:rPr>
+          <w:noProof/>
+        </w:rPr>
         <w:drawing>
           <wp:inline distT="0" distB="0" distL="0" distR="0" wp14:anchorId="3D6A25A2" wp14:editId="428DF157">
             <wp:extent cx="5943600" cy="3342005"/>
@@ -170,6 +179,9 @@
     </w:p>
     <w:p>
       <w:r>
+        <w:rPr>
+          <w:noProof/>
+        </w:rPr>
         <w:drawing>
           <wp:inline distT="0" distB="0" distL="0" distR="0" wp14:anchorId="56D4E30E" wp14:editId="469F50CE">
             <wp:extent cx="5943600" cy="3342005"/>
@@ -223,10 +235,10 @@
     <w:p>
       <w:r>
         <w:drawing>
-          <wp:inline distT="0" distB="0" distL="0" distR="0" wp14:anchorId="0013823D" wp14:editId="62438852">
-            <wp:extent cx="5943600" cy="3342005"/>
+          <wp:inline distT="0" distB="0" distL="0" distR="0" wp14:anchorId="71E79208" wp14:editId="6416FF98">
+            <wp:extent cx="5943600" cy="802640"/>
             <wp:effectExtent l="0" t="0" r="0" b="0"/>
-            <wp:docPr id="418061711" name="Picture 1"/>
+            <wp:docPr id="2066176421" name="Picture 1"/>
             <wp:cNvGraphicFramePr>
               <a:graphicFrameLocks xmlns:a="http://schemas.openxmlformats.org/drawingml/2006/main" noChangeAspect="1"/>
             </wp:cNvGraphicFramePr>
@@ -234,7 +246,7 @@
               <a:graphicData uri="http://schemas.openxmlformats.org/drawingml/2006/picture">
                 <pic:pic xmlns:pic="http://schemas.openxmlformats.org/drawingml/2006/picture">
                   <pic:nvPicPr>
-                    <pic:cNvPr id="418061711" name=""/>
+                    <pic:cNvPr id="2066176421" name=""/>
                     <pic:cNvPicPr/>
                   </pic:nvPicPr>
                   <pic:blipFill>
@@ -246,7 +258,7 @@
                   <pic:spPr>
                     <a:xfrm>
                       <a:off x="0" y="0"/>
-                      <a:ext cx="5943600" cy="3342005"/>
+                      <a:ext cx="5943600" cy="802640"/>
                     </a:xfrm>
                     <a:prstGeom prst="rect">
                       <a:avLst/>
@@ -273,6 +285,9 @@
     </w:p>
     <w:p>
       <w:r>
+        <w:rPr>
+          <w:noProof/>
+        </w:rPr>
         <w:drawing>
           <wp:inline distT="0" distB="0" distL="0" distR="0" wp14:anchorId="1545B276" wp14:editId="096F5C5F">
             <wp:extent cx="5943600" cy="3342005"/>
@@ -316,15 +331,18 @@
           <w:b/>
           <w:bCs/>
         </w:rPr>
+        <w:t>7. docker compose logs -f:</w:t>
+      </w:r>
+      <w:r>
+        <w:t> Xem nhật ký (logs) của các container liên tục theo thời gian thực (giống như đang xem trực tiếp nó chạy).</w:t>
+      </w:r>
+    </w:p>
+    <w:p>
+      <w:r>
+        <w:rPr>
+          <w:noProof/>
+        </w:rPr>
         <w:lastRenderedPageBreak/>
-        <w:t>7. docker compose logs -f:</w:t>
-      </w:r>
-      <w:r>
-        <w:t> Xem nhật ký (logs) của các container liên tục theo thời gian thực (giống như đang xem trực tiếp nó chạy).</w:t>
-      </w:r>
-    </w:p>
-    <w:p>
-      <w:r>
         <w:drawing>
           <wp:inline distT="0" distB="0" distL="0" distR="0" wp14:anchorId="4A7AAC5F" wp14:editId="0E61E384">
             <wp:extent cx="5943600" cy="3342005"/>
@@ -376,6 +394,9 @@
     </w:p>
     <w:p>
       <w:r>
+        <w:rPr>
+          <w:noProof/>
+        </w:rPr>
         <w:drawing>
           <wp:inline distT="0" distB="0" distL="0" distR="0" wp14:anchorId="377E32A1" wp14:editId="5A142CBF">
             <wp:extent cx="5943600" cy="3342005"/>
@@ -419,15 +440,18 @@
           <w:b/>
           <w:bCs/>
         </w:rPr>
+        <w:t>9. docker compose exec &lt;service_name&gt; &lt;command&gt;:</w:t>
+      </w:r>
+      <w:r>
+        <w:t> Thực thi một câu lệnh cụ thể bên trong một container đang chạy (Ví dụ: truy cập vào bash của container).</w:t>
+      </w:r>
+    </w:p>
+    <w:p>
+      <w:r>
+        <w:rPr>
+          <w:noProof/>
+        </w:rPr>
         <w:lastRenderedPageBreak/>
-        <w:t>9. docker compose exec &lt;service_name&gt; &lt;command&gt;:</w:t>
-      </w:r>
-      <w:r>
-        <w:t> Thực thi một câu lệnh cụ thể bên trong một container đang chạy (Ví dụ: truy cập vào bash của container).</w:t>
-      </w:r>
-    </w:p>
-    <w:p>
-      <w:r>
         <w:drawing>
           <wp:inline distT="0" distB="0" distL="0" distR="0" wp14:anchorId="2D34C19C" wp14:editId="743F1274">
             <wp:extent cx="5943600" cy="3342005"/>
@@ -479,6 +503,9 @@
     </w:p>
     <w:p>
       <w:r>
+        <w:rPr>
+          <w:noProof/>
+        </w:rPr>
         <w:drawing>
           <wp:inline distT="0" distB="0" distL="0" distR="0" wp14:anchorId="50D811F3" wp14:editId="6214D721">
             <wp:extent cx="5943600" cy="3342005"/>
@@ -522,15 +549,18 @@
           <w:b/>
           <w:bCs/>
         </w:rPr>
+        <w:t>11. docker compose run &lt;service_name&gt; &lt;command&gt;:</w:t>
+      </w:r>
+      <w:r>
+        <w:t> Tạo mới và chạy một container chỉ một lần (one-off) để thực thi một câu lệnh cụ thể rồi thoát.</w:t>
+      </w:r>
+    </w:p>
+    <w:p>
+      <w:r>
+        <w:rPr>
+          <w:noProof/>
+        </w:rPr>
         <w:lastRenderedPageBreak/>
-        <w:t>11. docker compose run &lt;service_name&gt; &lt;command&gt;:</w:t>
-      </w:r>
-      <w:r>
-        <w:t> Tạo mới và chạy một container chỉ một lần (one-off) để thực thi một câu lệnh cụ thể rồi thoát.</w:t>
-      </w:r>
-    </w:p>
-    <w:p>
-      <w:r>
         <w:drawing>
           <wp:inline distT="0" distB="0" distL="0" distR="0" wp14:anchorId="20774E9A" wp14:editId="37F9DDCA">
             <wp:extent cx="5943600" cy="3342005"/>
@@ -582,6 +612,9 @@
     </w:p>
     <w:p>
       <w:r>
+        <w:rPr>
+          <w:noProof/>
+        </w:rPr>
         <w:drawing>
           <wp:inline distT="0" distB="0" distL="0" distR="0" wp14:anchorId="577F3117" wp14:editId="2616B2BA">
             <wp:extent cx="5943600" cy="3342005"/>
@@ -625,15 +658,18 @@
           <w:b/>
           <w:bCs/>
         </w:rPr>
+        <w:t>13. docker compose rm &lt;service_name&gt;:</w:t>
+      </w:r>
+      <w:r>
+        <w:t> Xóa bỏ hoàn toàn các container đã bị dừng hoạt động trước đó.</w:t>
+      </w:r>
+    </w:p>
+    <w:p>
+      <w:r>
+        <w:rPr>
+          <w:noProof/>
+        </w:rPr>
         <w:lastRenderedPageBreak/>
-        <w:t>13. docker compose rm &lt;service_name&gt;:</w:t>
-      </w:r>
-      <w:r>
-        <w:t> Xóa bỏ hoàn toàn các container đã bị dừng hoạt động trước đó.</w:t>
-      </w:r>
-    </w:p>
-    <w:p>
-      <w:r>
         <w:drawing>
           <wp:inline distT="0" distB="0" distL="0" distR="0" wp14:anchorId="66B9240A" wp14:editId="0C1C2962">
             <wp:extent cx="5943600" cy="3342005"/>
@@ -685,6 +721,9 @@
     </w:p>
     <w:p>
       <w:r>
+        <w:rPr>
+          <w:noProof/>
+        </w:rPr>
         <w:drawing>
           <wp:inline distT="0" distB="0" distL="0" distR="0" wp14:anchorId="316355D6" wp14:editId="6687D9E8">
             <wp:extent cx="5943600" cy="3345180"/>
@@ -728,15 +767,18 @@
           <w:b/>
           <w:bCs/>
         </w:rPr>
+        <w:t>15. docker compose up -d --build:</w:t>
+      </w:r>
+      <w:r>
+        <w:t> Ép buộc build lại Docker image (nếu nhận thấy có thay đổi mã nguồn) và khởi động lại các container ở trạng thái chạy ngầm.</w:t>
+      </w:r>
+    </w:p>
+    <w:p>
+      <w:r>
+        <w:rPr>
+          <w:noProof/>
+        </w:rPr>
         <w:lastRenderedPageBreak/>
-        <w:t>15. docker compose up -d --build:</w:t>
-      </w:r>
-      <w:r>
-        <w:t> Ép buộc build lại Docker image (nếu nhận thấy có thay đổi mã nguồn) và khởi động lại các container ở trạng thái chạy ngầm.</w:t>
-      </w:r>
-    </w:p>
-    <w:p>
-      <w:r>
         <w:drawing>
           <wp:inline distT="0" distB="0" distL="0" distR="0" wp14:anchorId="773B7E41" wp14:editId="41715150">
             <wp:extent cx="5943600" cy="3342005"/>
@@ -1387,6 +1429,7 @@
   <w:style w:type="character" w:default="1" w:styleId="DefaultParagraphFont">
     <w:name w:val="Default Paragraph Font"/>
     <w:uiPriority w:val="1"/>
+    <w:semiHidden/>
     <w:unhideWhenUsed/>
   </w:style>
   <w:style w:type="table" w:default="1" w:styleId="TableNormal">

</xml_diff>